<commit_message>
Adopt Conda environment workflow
</commit_message>
<xml_diff>
--- a/docs/终极考核.docx
+++ b/docs/终极考核.docx
@@ -128,11 +128,9 @@
       </w:pPr>
       <w:r>
         <w:rPr>
-          <w:rFonts w:hint="eastAsia"/>
           <w:color w:val="000000"/>
-          <w:lang w:val="en-US" w:eastAsia="zh-CN"/>
         </w:rPr>
-        <w:t>本任务需要你从git拉取仓库</w:t>
+        <w:t>请在Anaconda Prompt中从GitHub拉取学生公开仓库，并依次运行：</w:t>
       </w:r>
     </w:p>
     <w:p>
@@ -148,9 +146,9 @@
       </w:pPr>
       <w:r>
         <w:rPr>
-          <w:rStyle w:val="136"/>
+          <w:color w:val="000000"/>
         </w:rPr>
-        <w:t>git clone https://github.com/david312213/robocup-uav-exam.git</w:t>
+        <w:t>git clone https://github.com/david312213/aquacore-test.git</w:t>
       </w:r>
     </w:p>
     <w:p>
@@ -166,9 +164,9 @@
       </w:pPr>
       <w:r>
         <w:rPr>
-          <w:rStyle w:val="136"/>
+          <w:color w:val="000000"/>
         </w:rPr>
-        <w:t>cd .\robocup-uav-exam</w:t>
+        <w:t>cd .\aquacore-test</w:t>
       </w:r>
     </w:p>
     <w:p>
@@ -186,15 +184,7 @@
       </w:pPr>
       <w:r>
         <w:rPr>
-          <w:rStyle w:val="136"/>
-          <w:rFonts w:hint="eastAsia"/>
-          <w:lang w:val="en-US" w:eastAsia="zh-CN"/>
-        </w:rPr>
-        <w:t>之后</w:t>
-      </w:r>
-      <w:r>
-        <w:rPr>
-          <w:rStyle w:val="136"/>
+          <w:color w:val="000000"/>
         </w:rPr>
         <w:t>.\setup_windows.bat</w:t>
       </w:r>
@@ -5861,7 +5851,7 @@
           <w:rFonts w:ascii="Arial" w:hAnsi="Arial" w:eastAsia="微软雅黑"/>
           <w:color w:val="000000"/>
         </w:rPr>
-        <w:t xml:space="preserve">安装64位Python 3.11或3.12，安装时勾选 </w:t>
+        <w:t>安装64位Miniconda，安装完成后打开</w:t>
       </w:r>
       <w:r>
         <w:rPr>
@@ -5870,14 +5860,46 @@
           <w:sz w:val="20"/>
           <w:shd w:val="clear" w:fill="F2F2F2"/>
         </w:rPr>
-        <w:t>Add Python to PATH</w:t>
+        <w:t>Anaconda Prompt</w:t>
       </w:r>
       <w:r>
         <w:rPr>
           <w:rFonts w:ascii="Arial" w:hAnsi="Arial" w:eastAsia="微软雅黑"/>
           <w:color w:val="000000"/>
         </w:rPr>
-        <w:t>。进入项目目录后首次运行：</w:t>
+        <w:t xml:space="preserve">。项目统一使用名为 </w:t>
+      </w:r>
+      <w:r>
+        <w:rPr>
+          <w:rFonts w:ascii="Consolas" w:hAnsi="Consolas" w:eastAsia="微软雅黑"/>
+          <w:color w:val="000000"/>
+          <w:sz w:val="20"/>
+          <w:shd w:val="clear" w:fill="F2F2F2"/>
+        </w:rPr>
+        <w:t>aquacore-test</w:t>
+      </w:r>
+      <w:r>
+        <w:rPr>
+          <w:rFonts w:ascii="Arial" w:hAnsi="Arial" w:eastAsia="微软雅黑"/>
+          <w:color w:val="000000"/>
+        </w:rPr>
+        <w:t xml:space="preserve"> 的Conda环境，Python版本由 </w:t>
+      </w:r>
+      <w:r>
+        <w:rPr>
+          <w:rFonts w:ascii="Consolas" w:hAnsi="Consolas" w:eastAsia="微软雅黑"/>
+          <w:color w:val="000000"/>
+          <w:sz w:val="20"/>
+          <w:shd w:val="clear" w:fill="F2F2F2"/>
+        </w:rPr>
+        <w:t>environment.yml</w:t>
+      </w:r>
+      <w:r>
+        <w:rPr>
+          <w:rFonts w:ascii="Arial" w:hAnsi="Arial" w:eastAsia="微软雅黑"/>
+          <w:color w:val="000000"/>
+        </w:rPr>
+        <w:t xml:space="preserve"> 固定为3.11。进入项目目录后首次运行：</w:t>
       </w:r>
     </w:p>
     <w:p>
@@ -5913,6 +5935,64 @@
           <w:color w:val="000000"/>
         </w:rPr>
         <w:t>运行一个公开场景并查看三维回放：</w:t>
+      </w:r>
+    </w:p>
+    <w:p>
+      <w:pPr>
+        <w:keepLines/>
+        <w:widowControl/>
+        <w:pBdr>
+          <w:top w:val="single" w:color="000000" w:sz="4" w:space="4"/>
+          <w:left w:val="single" w:color="000000" w:sz="4" w:space="4"/>
+          <w:bottom w:val="single" w:color="000000" w:sz="4" w:space="4"/>
+          <w:right w:val="single" w:color="000000" w:sz="4" w:space="4"/>
+        </w:pBdr>
+        <w:shd w:val="clear" w:fill="F2F2F2"/>
+        <w:spacing w:before="60" w:after="140" w:line="252" w:lineRule="auto"/>
+        <w:ind w:left="230" w:right="230"/>
+      </w:pPr>
+      <w:r>
+        <w:rPr>
+          <w:rFonts w:ascii="Consolas" w:hAnsi="Consolas" w:eastAsia="微软雅黑"/>
+          <w:color w:val="000000"/>
+          <w:sz w:val="17"/>
+        </w:rPr>
+        <w:t>conda run -n aquacore-test python .\run_sim.py --controller student --seed 1001 --animate --events</w:t>
+      </w:r>
+    </w:p>
+    <w:p>
+      <w:pPr>
+        <w:widowControl/>
+      </w:pPr>
+      <w:r>
+        <w:rPr>
+          <w:rFonts w:ascii="Arial" w:hAnsi="Arial" w:eastAsia="微软雅黑"/>
+          <w:color w:val="000000"/>
+        </w:rPr>
+        <w:t>运行全部20个公开场景：</w:t>
+      </w:r>
+    </w:p>
+    <w:p>
+      <w:pPr>
+        <w:keepLines/>
+        <w:widowControl/>
+        <w:pBdr>
+          <w:top w:val="single" w:color="000000" w:sz="4" w:space="4"/>
+          <w:left w:val="single" w:color="000000" w:sz="4" w:space="4"/>
+          <w:bottom w:val="single" w:color="000000" w:sz="4" w:space="4"/>
+          <w:right w:val="single" w:color="000000" w:sz="4" w:space="4"/>
+        </w:pBdr>
+        <w:shd w:val="clear" w:fill="F2F2F2"/>
+        <w:spacing w:before="60" w:after="140" w:line="252" w:lineRule="auto"/>
+        <w:ind w:left="230" w:right="230"/>
+      </w:pPr>
+      <w:r>
+        <w:rPr>
+          <w:rFonts w:ascii="Consolas" w:hAnsi="Consolas" w:eastAsia="微软雅黑"/>
+          <w:color w:val="000000"/>
+          <w:sz w:val="17"/>
+        </w:rPr>
+        <w:t>conda run -n aquacore-test python .\evaluate.py --controller student --profiles adaptive</w:t>
       </w:r>
     </w:p>
     <w:p>

</xml_diff>